<commit_message>
Redesign completo, geração real do laudo, gestão de usuários/imóveis
- Frontend redesenhado (tema escuro/azul da Q&A Company): AppShell com
  navegação lateral, sistema de componentes (ui.tsx), PRODUCT.md/DESIGN.md
- Descrição do laudo agora segue o modelo real da imobiliária (título em
  negrito/maiúsculo + frase fixa + corpo com rótulos em negrito automático,
  sem o aviso de direitos autorais); descrição por IA removida
- Geração de laudo real via subprocesso Python/docxtpl (RichText pro aviso
  de locação em vermelho e pra descrição formatada), conversão pra PDF via
  LibreOffice, exclusão de laudo e de imóvel inteiro com confirmação
- Status do imóvel virou pendente/finalizado/publicado (fluxo real pedido
  pela equipe), com filtros no dashboard
- Admin: editar e excluir corretores (bloqueado se ainda tiverem imóveis)
- Classificação de fotos por IA usando a Claude real (chave configurada)

Co-Authored-By: Claude Sonnet 5 <noreply@anthropic.com>
</commit_message>
<xml_diff>
--- a/templates/laudo/exemplo_renderizado.docx
+++ b/templates/laudo/exemplo_renderizado.docx
@@ -6273,7 +6273,96 @@
           <w:sz w:val="28"/>
           <w:szCs w:val="28"/>
         </w:rPr>
-        <w:t xml:space="preserve"> Excelente apartamento duplex com vista mar, totalmente reformado, próximo a comércio e transporte público.</w:t>
+        <w:t xml:space="preserve"> </w:t>
+      </w:r>
+      <w:r>
+        <w:rPr>
+          <w:sz w:val="28"/>
+          <w:szCs w:val="28"/>
+          <w:b/>
+        </w:rPr>
+        <w:t xml:space="preserve">EXCELENTE APARTAMENTO DUPLEX COM VISTA MAR, TOTALMENTE REFORMADO, À VENDA NO CONDOMÍNIO ÁGUAS CLARAS NA BARRA DA TIJUCA COM SEGURANÇA 24 HORAS.</w:t>
+      </w:r>
+      <w:r>
+        <w:br/>
+      </w:r>
+      <w:r>
+        <w:br/>
+      </w:r>
+      <w:r>
+        <w:rPr>
+          <w:sz w:val="28"/>
+          <w:szCs w:val="28"/>
+          <w:i/>
+          <w:u w:val="single"/>
+        </w:rPr>
+        <w:t xml:space="preserve">O imóvel vem descrito da seguinte forma:</w:t>
+      </w:r>
+      <w:r>
+        <w:br/>
+      </w:r>
+      <w:r>
+        <w:br/>
+      </w:r>
+      <w:r>
+        <w:rPr>
+          <w:sz w:val="28"/>
+          <w:szCs w:val="28"/>
+          <w:b/>
+        </w:rPr>
+        <w:t xml:space="preserve">1º Pavimento:</w:t>
+      </w:r>
+      <w:r>
+        <w:rPr>
+          <w:sz w:val="28"/>
+          <w:szCs w:val="28"/>
+        </w:rPr>
+        <w:t xml:space="preserve"> Sala em três ambientes com vista mar, cozinha planejada e lavabo.</w:t>
+      </w:r>
+      <w:r>
+        <w:br/>
+      </w:r>
+      <w:r>
+        <w:br/>
+      </w:r>
+      <w:r>
+        <w:rPr>
+          <w:sz w:val="28"/>
+          <w:szCs w:val="28"/>
+          <w:b/>
+        </w:rPr>
+        <w:t xml:space="preserve">2º Pavimento:</w:t>
+      </w:r>
+      <w:r>
+        <w:rPr>
+          <w:sz w:val="28"/>
+          <w:szCs w:val="28"/>
+        </w:rPr>
+        <w:t xml:space="preserve"> Duas suítes, sendo a master com closet e banheira de hidromassagem.</w:t>
+      </w:r>
+      <w:r>
+        <w:br/>
+      </w:r>
+      <w:r>
+        <w:br/>
+      </w:r>
+      <w:r>
+        <w:rPr>
+          <w:sz w:val="28"/>
+          <w:szCs w:val="28"/>
+          <w:b/>
+        </w:rPr>
+        <w:t xml:space="preserve">Área de lazer:</w:t>
+      </w:r>
+      <w:r>
+        <w:rPr>
+          <w:sz w:val="28"/>
+          <w:szCs w:val="28"/>
+        </w:rPr>
+        <w:t xml:space="preserve"> Piscina, área gourmet com churrasqueira e academia.</w:t>
+      </w:r>
+      <w:r>
+        <w:t xml:space="preserve"/>
       </w:r>
     </w:p>
     <w:sectPr>

</xml_diff>